<commit_message>
Report 7.11: the better policy fixes the planner's jumps, not its routes
From the failure modes already in results/planner/: jump failures fall from
21 to 11 (standard) and 45 to 29 (obstacles) with the final policy, route
failures only from 104 to 98 and 116 to 110; 98 of the 109 failed standard
courses are route failures.

Co-Authored-By: Claude Opus 5.5 <noreply@anthropic.com>
Claude-Session: https://claude.ai/code/session_01BUdrQE5NdZudN3tKMcLzvh
</commit_message>
<xml_diff>
--- a/results/report_draft.docx
+++ b/results/report_draft.docx
@@ -6027,13 +6027,43 @@
         <w:t xml:space="preserve"> </w:t>
       </w:r>
       <w:r>
-        <w:t xml:space="preserve">simulator on every course, with 0 server corrections. The failure analysis</w:t>
-      </w:r>
-      <w:r>
-        <w:t xml:space="preserve"> </w:t>
-      </w:r>
-      <w:r>
-        <w:t xml:space="preserve">below is for the first final policy.</w:t>
+        <w:t xml:space="preserve">simulator on every course, with 0 server corrections. The better policy</w:t>
+      </w:r>
+      <w:r>
+        <w:t xml:space="preserve"> </w:t>
+      </w:r>
+      <w:r>
+        <w:t xml:space="preserve">fixes jumps, not routes: of the planner’s failed courses, those where the</w:t>
+      </w:r>
+      <w:r>
+        <w:t xml:space="preserve"> </w:t>
+      </w:r>
+      <w:r>
+        <w:t xml:space="preserve">jump itself failed drop from 21 to 11 (standard) and from 45 to 29</w:t>
+      </w:r>
+      <w:r>
+        <w:t xml:space="preserve"> </w:t>
+      </w:r>
+      <w:r>
+        <w:t xml:space="preserve">(obstacles), while those where the plan had left the course’s order stay</w:t>
+      </w:r>
+      <w:r>
+        <w:t xml:space="preserve"> </w:t>
+      </w:r>
+      <w:r>
+        <w:t xml:space="preserve">almost the same (104 to 98, 116 to 110). With the final policy, 98 of the</w:t>
+      </w:r>
+      <w:r>
+        <w:t xml:space="preserve"> </w:t>
+      </w:r>
+      <w:r>
+        <w:t xml:space="preserve">109 failed standard courses are route failures. The analysis below is for</w:t>
+      </w:r>
+      <w:r>
+        <w:t xml:space="preserve"> </w:t>
+      </w:r>
+      <w:r>
+        <w:t xml:space="preserve">the first final policy.</w:t>
       </w:r>
     </w:p>
     <w:p>

</xml_diff>

<commit_message>
Report introduction: the neo and route-planner contributions (still 20 pages)
Co-Authored-By: Claude Opus 5.5 <noreply@anthropic.com>
Claude-Session: https://claude.ai/code/session_01BUdrQE5NdZudN3tKMcLzvh
</commit_message>
<xml_diff>
--- a/results/report_draft.docx
+++ b/results/report_draft.docx
@@ -167,6 +167,48 @@
       </w:r>
       <w:r>
         <w:t xml:space="preserve">a tick-by-tick check that the game and the simulator agree (section 6).</w:t>
+      </w:r>
+    </w:p>
+    <w:p>
+      <w:pPr>
+        <w:numPr>
+          <w:ilvl w:val="0"/>
+          <w:numId w:val="1001"/>
+        </w:numPr>
+        <w:pStyle w:val="Compact"/>
+      </w:pPr>
+      <w:r>
+        <w:t xml:space="preserve">Neo jumps, which exploration never found, learned from search</w:t>
+      </w:r>
+      <w:r>
+        <w:t xml:space="preserve"> </w:t>
+      </w:r>
+      <w:r>
+        <w:t xml:space="preserve">demonstrations and DAgger (section 7.10).</w:t>
+      </w:r>
+    </w:p>
+    <w:p>
+      <w:pPr>
+        <w:numPr>
+          <w:ilvl w:val="0"/>
+          <w:numId w:val="1001"/>
+        </w:numPr>
+        <w:pStyle w:val="Compact"/>
+      </w:pPr>
+      <w:r>
+        <w:t xml:space="preserve">A route planner that lets the same policy play without being told the</w:t>
+      </w:r>
+      <w:r>
+        <w:t xml:space="preserve"> </w:t>
+      </w:r>
+      <w:r>
+        <w:t xml:space="preserve">platforms, against a model that learns to find its own route (sections</w:t>
+      </w:r>
+      <w:r>
+        <w:t xml:space="preserve"> </w:t>
+      </w:r>
+      <w:r>
+        <w:t xml:space="preserve">7.11 and 7.12).</w:t>
       </w:r>
     </w:p>
     <w:bookmarkEnd w:id="20"/>

</xml_diff>

<commit_message>
One policy for everything: the neo policy is 2-3 points behind on levels 0-5
Levels 0-5 of the advanced test set are exactly the standard (and obstacle)
test courses, so the neo runs' logged scores compare per level with the
final policy's. The chosen neo policy (neo-dagger3, iteration 449) completes
96.5% standard and 92.5% obstacle courses at levels 0-5 (final policy 98.4
and 95.2); the final policy completes 0 of the 210 neo courses and 71.0,
3.5 and 1.5% at levels 6-8 (neo policy 80.5, 46.5, 71.5).
scripts/one_policy_check.py -> results/neo/one_policy_comparison.json.
Report 7.10 and 8, the handoff (and its snapshot note, which wrongly said
the two groups of runs are not comparable) and team status updated.

Co-Authored-By: Claude Opus 5.5 <noreply@anthropic.com>
Claude-Session: https://claude.ai/code/session_01BUdrQE5NdZudN3tKMcLzvh
</commit_message>
<xml_diff>
--- a/results/report_draft.docx
+++ b/results/report_draft.docx
@@ -4882,19 +4882,49 @@
         <w:t xml:space="preserve"> </w:t>
       </w:r>
       <w:r>
-        <w:t xml:space="preserve">(Ross et al., 2011). The neo policy is a separate policy from the final one:</w:t>
-      </w:r>
-      <w:r>
-        <w:t xml:space="preserve"> </w:t>
-      </w:r>
-      <w:r>
-        <w:t xml:space="preserve">it is built on the discount-0.99 line of runs and was not run through the</w:t>
-      </w:r>
-      <w:r>
-        <w:t xml:space="preserve"> </w:t>
-      </w:r>
-      <w:r>
-        <w:t xml:space="preserve">checks of sections 7.4 to 7.9.</w:t>
+        <w:t xml:space="preserve">(Ross et al., 2011). The neo policy is separate from the final one (it is</w:t>
+      </w:r>
+      <w:r>
+        <w:t xml:space="preserve"> </w:t>
+      </w:r>
+      <w:r>
+        <w:t xml:space="preserve">built on the discount-0.99 runs), but it is close to being one policy for</w:t>
+      </w:r>
+      <w:r>
+        <w:t xml:space="preserve"> </w:t>
+      </w:r>
+      <w:r>
+        <w:t xml:space="preserve">everything: levels 0 to 5 of its test set are exactly the standard test</w:t>
+      </w:r>
+      <w:r>
+        <w:t xml:space="preserve"> </w:t>
+      </w:r>
+      <w:r>
+        <w:t xml:space="preserve">courses, where it completes 96.5% (obstacles: 92.5%), 1.9 and 2.7 points</w:t>
+      </w:r>
+      <w:r>
+        <w:t xml:space="preserve"> </w:t>
+      </w:r>
+      <w:r>
+        <w:t xml:space="preserve">below the final policy, while the final policy completes none of the 210 neo</w:t>
+      </w:r>
+      <w:r>
+        <w:t xml:space="preserve"> </w:t>
+      </w:r>
+      <w:r>
+        <w:t xml:space="preserve">courses (levels 6, 7, 8: 71.0, 3.5, 1.5% against 80.5, 46.5, 71.5%;</w:t>
+      </w:r>
+      <w:r>
+        <w:t xml:space="preserve"> </w:t>
+      </w:r>
+      <w:r>
+        <w:rPr>
+          <w:rStyle w:val="VerbatimChar"/>
+        </w:rPr>
+        <w:t xml:space="preserve">results/neo/one_policy_comparison.json</w:t>
+      </w:r>
+      <w:r>
+        <w:t xml:space="preserve">).</w:t>
       </w:r>
     </w:p>
     <w:bookmarkEnd w:id="47"/>
@@ -7276,7 +7306,13 @@
         <w:t xml:space="preserve"> </w:t>
       </w:r>
       <w:r>
-        <w:t xml:space="preserve">and the neo policy for levels 6 to 8. One policy for both was not tried.</w:t>
+        <w:t xml:space="preserve">and the neo policy, 2 to 3 points behind it there but far ahead on levels</w:t>
+      </w:r>
+      <w:r>
+        <w:t xml:space="preserve"> </w:t>
+      </w:r>
+      <w:r>
+        <w:t xml:space="preserve">6 to 8. A neo fine-tune of the discount-0.995 policy was not tried.</w:t>
       </w:r>
     </w:p>
     <w:p>

</xml_diff>

<commit_message>
Course report trimmed to fit 20 pages: body ends on page 20
Ethan: "Yes, trim it". About 160 words net: section 3's speed paragraph
and repeats in 7.1, 7.3, 7.7, 8 and 9. An independent check of the cuts
kept the one-evaluation drop at 1.0 billion ticks (figure 2) and the
detector file's round numbering.

scripts/report_docx.py --pdf: 22 pages, 19 before the References page,
the body ending about three quarters down page 20 (before the trim it ran
two lines onto page 21). results/report_draft.docx and .pdf are this
export; HANDOFF, TEAM_STATUS and results/DATA.md updated.

Co-Authored-By: Claude Opus 5.5 <noreply@anthropic.com>
</commit_message>
<xml_diff>
--- a/results/report_draft.docx
+++ b/results/report_draft.docx
@@ -683,93 +683,6 @@
       </w:r>
       <w:r>
         <w:t xml:space="preserve">1.4e-14 blocks, and every on-ground, collision and cooldown flag matched.</w:t>
-      </w:r>
-    </w:p>
-    <w:p>
-      <w:pPr>
-        <w:pStyle w:val="BodyText"/>
-      </w:pPr>
-      <w:r>
-        <w:rPr>
-          <w:b/>
-          <w:bCs/>
-        </w:rPr>
-        <w:t xml:space="preserve">Speed.</w:t>
-      </w:r>
-      <w:r>
-        <w:t xml:space="preserve"> </w:t>
-      </w:r>
-      <w:r>
-        <w:t xml:space="preserve">The environment step never reads values back from the GPU. With</w:t>
-      </w:r>
-      <w:r>
-        <w:t xml:space="preserve"> </w:t>
-      </w:r>
-      <w:r>
-        <w:t xml:space="preserve">16,384 parallel environments, training on one RTX 5080 runs at about 170,000</w:t>
-      </w:r>
-      <w:r>
-        <w:t xml:space="preserve"> </w:t>
-      </w:r>
-      <w:r>
-        <w:t xml:space="preserve">to 220,000 game ticks per second over whole runs, evaluations included</w:t>
-      </w:r>
-      <w:r>
-        <w:t xml:space="preserve"> </w:t>
-      </w:r>
-      <w:r>
-        <w:t xml:space="preserve">(</w:t>
-      </w:r>
-      <w:r>
-        <w:rPr>
-          <w:rStyle w:val="VerbatimChar"/>
-        </w:rPr>
-        <w:t xml:space="preserve">main-s0</w:t>
-      </w:r>
-      <w:r>
-        <w:t xml:space="preserve">,</w:t>
-      </w:r>
-      <w:r>
-        <w:t xml:space="preserve"> </w:t>
-      </w:r>
-      <w:r>
-        <w:rPr>
-          <w:rStyle w:val="VerbatimChar"/>
-        </w:rPr>
-        <w:t xml:space="preserve">main-g995</w:t>
-      </w:r>
-      <w:r>
-        <w:t xml:space="preserve"> </w:t>
-      </w:r>
-      <w:r>
-        <w:t xml:space="preserve">and</w:t>
-      </w:r>
-      <w:r>
-        <w:t xml:space="preserve"> </w:t>
-      </w:r>
-      <w:r>
-        <w:rPr>
-          <w:rStyle w:val="VerbatimChar"/>
-        </w:rPr>
-        <w:t xml:space="preserve">obstacles-g995</w:t>
-      </w:r>
-      <w:r>
-        <w:t xml:space="preserve"> </w:t>
-      </w:r>
-      <w:r>
-        <w:t xml:space="preserve">in</w:t>
-      </w:r>
-      <w:r>
-        <w:t xml:space="preserve"> </w:t>
-      </w:r>
-      <w:r>
-        <w:rPr>
-          <w:rStyle w:val="VerbatimChar"/>
-        </w:rPr>
-        <w:t xml:space="preserve">results/runs/</w:t>
-      </w:r>
-      <w:r>
-        <w:t xml:space="preserve">).</w:t>
       </w:r>
     </w:p>
     <w:p>
@@ -2142,19 +2055,19 @@
         <w:t xml:space="preserve"> </w:t>
       </w:r>
       <w:r>
-        <w:t xml:space="preserve">Levels 0 to 4 pass 90% within 0.08 billion ticks; level 5 reaches 78% by 0.55</w:t>
-      </w:r>
-      <w:r>
-        <w:t xml:space="preserve"> </w:t>
-      </w:r>
-      <w:r>
-        <w:t xml:space="preserve">billion and then stays between 64 and 92%, apart from one short dip at 1.0</w:t>
-      </w:r>
-      <w:r>
-        <w:t xml:space="preserve"> </w:t>
-      </w:r>
-      <w:r>
-        <w:t xml:space="preserve">billion (figure 2). Section 7.3 repeats it with discount 0.995.</w:t>
+        <w:t xml:space="preserve">Levels 0 to 4 pass 90% within 0.08 billion ticks, and level 5 reaches 78% by</w:t>
+      </w:r>
+      <w:r>
+        <w:t xml:space="preserve"> </w:t>
+      </w:r>
+      <w:r>
+        <w:t xml:space="preserve">0.55 billion (figure 2; the drop at 1.0 billion lasted one evaluation).</w:t>
+      </w:r>
+      <w:r>
+        <w:t xml:space="preserve"> </w:t>
+      </w:r>
+      <w:r>
+        <w:t xml:space="preserve">Section 7.3 repeats it with discount 0.995.</w:t>
       </w:r>
     </w:p>
     <w:p>
@@ -3541,19 +3454,13 @@
         <w:t xml:space="preserve"> </w:t>
       </w:r>
       <w:r>
-        <w:t xml:space="preserve">the far goal pulls harder. A shorter horizon (0.98) and a tighter KL target</w:t>
-      </w:r>
-      <w:r>
-        <w:t xml:space="preserve"> </w:t>
-      </w:r>
-      <w:r>
-        <w:t xml:space="preserve">hurt most. The large network is the best single run on level 5 (83.5%), but</w:t>
-      </w:r>
-      <w:r>
-        <w:t xml:space="preserve"> </w:t>
-      </w:r>
-      <w:r>
-        <w:t xml:space="preserve">it is one seed and below the bar on validation.</w:t>
+        <w:t xml:space="preserve">the far goal pulls harder. The large network is the best single run on level</w:t>
+      </w:r>
+      <w:r>
+        <w:t xml:space="preserve"> </w:t>
+      </w:r>
+      <w:r>
+        <w:t xml:space="preserve">5 (83.5%), but it is one seed and below the bar on validation.</w:t>
       </w:r>
     </w:p>
     <w:p>
@@ -4468,16 +4375,13 @@
         <w:t xml:space="preserve"> </w:t>
       </w:r>
       <w:r>
-        <w:t xml:space="preserve">Round 1’s detector also counted one-block-up jumps (only</w:t>
-      </w:r>
-      <w:r>
-        <w:t xml:space="preserve"> </w:t>
-      </w:r>
-      <w:r>
-        <w:t xml:space="preserve">1,090 of its 2,526 takeoffs were neos;</w:t>
-      </w:r>
-      <w:r>
-        <w:t xml:space="preserve"> </w:t>
+        <w:t xml:space="preserve">Round 1 also counted one-block-up jumps as neo takeoffs</w:t>
+      </w:r>
+      <w:r>
+        <w:t xml:space="preserve"> </w:t>
+      </w:r>
+      <w:r>
+        <w:t xml:space="preserve">(</w:t>
       </w:r>
       <w:r>
         <w:rPr>
@@ -4486,19 +4390,13 @@
         <w:t xml:space="preserve">results/neo/detector_check.json</w:t>
       </w:r>
       <w:r>
-        <w:t xml:space="preserve">,</w:t>
-      </w:r>
-      <w:r>
-        <w:t xml:space="preserve"> </w:t>
-      </w:r>
-      <w:r>
-        <w:t xml:space="preserve">which counts the collapsed attempt as round 1); from round 2 on, only wall</w:t>
-      </w:r>
-      <w:r>
-        <w:t xml:space="preserve"> </w:t>
-      </w:r>
-      <w:r>
-        <w:t xml:space="preserve">blocks count.</w:t>
+        <w:t xml:space="preserve">, which calls it round 2); from round 2</w:t>
+      </w:r>
+      <w:r>
+        <w:t xml:space="preserve"> </w:t>
+      </w:r>
+      <w:r>
+        <w:t xml:space="preserve">on, only wall blocks count.</w:t>
       </w:r>
     </w:p>
     <w:p>
@@ -4889,27 +4787,6 @@
       </w:r>
       <w:r>
         <w:t xml:space="preserve">offline, in real Minecraft and in the simulator, with 0 server corrections.</w:t>
-      </w:r>
-      <w:r>
-        <w:t xml:space="preserve"> </w:t>
-      </w:r>
-      <w:r>
-        <w:t xml:space="preserve">Our generator puts every neo after a one-block-wide takeoff, though the search</w:t>
-      </w:r>
-      <w:r>
-        <w:t xml:space="preserve"> </w:t>
-      </w:r>
-      <w:r>
-        <w:t xml:space="preserve">also lands some from 2x2 takeoffs (</w:t>
-      </w:r>
-      <w:r>
-        <w:rPr>
-          <w:rStyle w:val="VerbatimChar"/>
-        </w:rPr>
-        <w:t xml:space="preserve">results/neo/wide_takeoff_search.json</w:t>
-      </w:r>
-      <w:r>
-        <w:t xml:space="preserve">).</w:t>
       </w:r>
       <w:r>
         <w:t xml:space="preserve"> </w:t>
@@ -6341,19 +6218,13 @@
         <w:t xml:space="preserve"> </w:t>
       </w:r>
       <w:r>
-        <w:t xml:space="preserve">A Mineflayer bot computes its own movement</w:t>
-      </w:r>
-      <w:r>
-        <w:t xml:space="preserve"> </w:t>
-      </w:r>
-      <w:r>
-        <w:t xml:space="preserve">with prismarine-physics, so a simulator that reproduces prismarine-physics</w:t>
-      </w:r>
-      <w:r>
-        <w:t xml:space="preserve"> </w:t>
-      </w:r>
-      <w:r>
-        <w:t xml:space="preserve">reproduces the game as the bot experiences it. In 1,394 real-game episodes</w:t>
+        <w:t xml:space="preserve">The simulator reproduces the bot’s own physics</w:t>
+      </w:r>
+      <w:r>
+        <w:t xml:space="preserve"> </w:t>
+      </w:r>
+      <w:r>
+        <w:t xml:space="preserve">engine (section 3). In 1,394 real-game episodes</w:t>
       </w:r>
       <w:r>
         <w:t xml:space="preserve"> </w:t>
@@ -6485,19 +6356,13 @@
         <w:t xml:space="preserve"> </w:t>
       </w:r>
       <w:r>
-        <w:t xml:space="preserve">test (simulator), and most of its remaining failures are failed jumps. A</w:t>
-      </w:r>
-      <w:r>
-        <w:t xml:space="preserve"> </w:t>
-      </w:r>
-      <w:r>
-        <w:t xml:space="preserve">policy that learns route and jumps together stays below the greedy planner on</w:t>
-      </w:r>
-      <w:r>
-        <w:t xml:space="preserve"> </w:t>
-      </w:r>
-      <w:r>
-        <w:t xml:space="preserve">both test sets (section 7.9).</w:t>
+        <w:t xml:space="preserve">test (simulator), and most of its remaining failures are failed jumps</w:t>
+      </w:r>
+      <w:r>
+        <w:t xml:space="preserve"> </w:t>
+      </w:r>
+      <w:r>
+        <w:t xml:space="preserve">(section 7.9).</w:t>
       </w:r>
     </w:p>
     <w:p>
@@ -6931,13 +6796,7 @@
         <w:t xml:space="preserve"> </w:t>
       </w:r>
       <w:r>
-        <w:t xml:space="preserve">corrections. No double or triple neo landed in 64</w:t>
-      </w:r>
-      <w:r>
-        <w:t xml:space="preserve"> </w:t>
-      </w:r>
-      <w:r>
-        <w:t xml:space="preserve">searched layouts: evidence, not proof, that they are impossible.</w:t>
+        <w:t xml:space="preserve">corrections.</w:t>
       </w:r>
     </w:p>
     <w:p>

</xml_diff>

<commit_message>
Tonight's records checked: corrections, simulator labels, the slide draft
An independent check of tonight's records (two checkers and a skeptic per
finding) confirmed 15 findings, none touching a headline number. Fixed:
- tonight's neo-routing run is rule 4's lever D (plan_ahead), not "every
  router decision";
- HANDOFF item 7: the neo policy did play configs/neo_live_courses.json in
  real Minecraft (11/31); only the neo assist did not;
- TEAM_STATUS open problem 5 reflects the new export, and the gate claim
  is more precise;
- simulator labels added and the new bracketed notes dated; the level-5
  script's check saved as runs/level5-sets-final-check.json;
- the report's 7.8 now says walled platforms stay the router's
  candidates. Export at 03:58; the body still ends on page 20.

A first draft of the presentation (15 slides, private artifact) is noted
in HANDOFF; results page version 26.

Co-Authored-By: Claude Opus 5.5 <noreply@anthropic.com>
</commit_message>
<xml_diff>
--- a/results/report_draft.docx
+++ b/results/report_draft.docx
@@ -5283,7 +5283,13 @@
         <w:t xml:space="preserve"> </w:t>
       </w:r>
       <w:r>
-        <w:t xml:space="preserve">platforms, a choice whose path a wall blocks is searched as a neo, and with</w:t>
+        <w:t xml:space="preserve">among platforms, walled ones included, a choice whose path a wall blocks is</w:t>
+      </w:r>
+      <w:r>
+        <w:t xml:space="preserve"> </w:t>
+      </w:r>
+      <w:r>
+        <w:t xml:space="preserve">searched as a neo, and with</w:t>
       </w:r>
       <w:r>
         <w:t xml:space="preserve"> </w:t>
@@ -5298,7 +5304,13 @@
         <w:t xml:space="preserve"> </w:t>
       </w:r>
       <w:r>
-        <w:t xml:space="preserve">so is every later decision while plans land. Chosen on validation</w:t>
+        <w:t xml:space="preserve">so is every later decision while plans</w:t>
+      </w:r>
+      <w:r>
+        <w:t xml:space="preserve"> </w:t>
+      </w:r>
+      <w:r>
+        <w:t xml:space="preserve">land. Chosen on validation</w:t>
       </w:r>
       <w:r>
         <w:t xml:space="preserve"> </w:t>
@@ -5334,16 +5346,7 @@
         <w:t xml:space="preserve"> </w:t>
       </w:r>
       <w:r>
-        <w:t xml:space="preserve">own, and at it (</w:t>
-      </w:r>
-      <w:r>
-        <w:rPr>
-          <w:rStyle w:val="VerbatimChar"/>
-        </w:rPr>
-        <w:t xml:space="preserve">results/neo_routing/</w:t>
-      </w:r>
-      <w:r>
-        <w:t xml:space="preserve">).</w:t>
+        <w:t xml:space="preserve">own, and at it.</w:t>
       </w:r>
     </w:p>
     <w:p>

</xml_diff>

<commit_message>
Single neos by a network, no search: the neo skill after two DAgger rounds, 277 of 320 (86.6%) on fresh test family 50, 85.9% of 960 test courses; real Minecraft 59/64, 0 corrections
Records: the tests, bots, planner references on families 49 and 50, report (20 pages), results page, README, TEAM_STATUS, DATA and the generated results section.

Co-Authored-By: Claude Opus 5.5 <noreply@anthropic.com>
</commit_message>
<xml_diff>
--- a/results/report_draft.docx
+++ b/results/report_draft.docx
@@ -174,19 +174,25 @@
         <w:t xml:space="preserve"> </w:t>
       </w:r>
       <w:r>
-        <w:t xml:space="preserve">from search demonstrations and DAgger (section 7.7), and planned at play</w:t>
-      </w:r>
-      <w:r>
-        <w:t xml:space="preserve"> </w:t>
-      </w:r>
-      <w:r>
-        <w:t xml:space="preserve">time with the exact simulator, narrowly meeting our 85% single-neo goal</w:t>
-      </w:r>
-      <w:r>
-        <w:t xml:space="preserve"> </w:t>
-      </w:r>
-      <w:r>
-        <w:t xml:space="preserve">(section 7.8).</w:t>
+        <w:t xml:space="preserve">from search demonstrations and DAgger (section 7.7), planned at play time</w:t>
+      </w:r>
+      <w:r>
+        <w:t xml:space="preserve"> </w:t>
+      </w:r>
+      <w:r>
+        <w:t xml:space="preserve">with the exact simulator, narrowly meeting our 85% single-neo goal, and</w:t>
+      </w:r>
+      <w:r>
+        <w:t xml:space="preserve"> </w:t>
+      </w:r>
+      <w:r>
+        <w:t xml:space="preserve">then reached with no search by a learned neo skill on a fresh test</w:t>
+      </w:r>
+      <w:r>
+        <w:t xml:space="preserve"> </w:t>
+      </w:r>
+      <w:r>
+        <w:t xml:space="preserve">set (section 7.8).</w:t>
       </w:r>
     </w:p>
     <w:p>
@@ -4028,13 +4034,7 @@
         <w:t xml:space="preserve"> </w:t>
       </w:r>
       <w:r>
-        <w:t xml:space="preserve">diagonal jumps. Fine-tuned on levels 0 to 8 for about 1,700 iterations, the</w:t>
-      </w:r>
-      <w:r>
-        <w:t xml:space="preserve"> </w:t>
-      </w:r>
-      <w:r>
-        <w:t xml:space="preserve">discount-0.99 policy</w:t>
+        <w:t xml:space="preserve">diagonal jumps. Fine-tuned on them,</w:t>
       </w:r>
       <w:r>
         <w:t xml:space="preserve"> </w:t>
@@ -4049,19 +4049,19 @@
         <w:t xml:space="preserve"> </w:t>
       </w:r>
       <w:r>
-        <w:t xml:space="preserve">(section 7.3) stayed at about 70% of the</w:t>
-      </w:r>
-      <w:r>
-        <w:t xml:space="preserve"> </w:t>
-      </w:r>
-      <w:r>
-        <w:t xml:space="preserve">level-6 test courses (70.0% before) and rose from 7% to 30% on level 7, then</w:t>
-      </w:r>
-      <w:r>
-        <w:t xml:space="preserve"> </w:t>
-      </w:r>
-      <w:r>
-        <w:t xml:space="preserve">stayed flat; both come from courses without a neo.</w:t>
+        <w:t xml:space="preserve">(section 7.3) stayed at</w:t>
+      </w:r>
+      <w:r>
+        <w:t xml:space="preserve"> </w:t>
+      </w:r>
+      <w:r>
+        <w:t xml:space="preserve">about 70% on level 6 and rose from 7% to 30% on level 7, every success on a</w:t>
+      </w:r>
+      <w:r>
+        <w:t xml:space="preserve"> </w:t>
+      </w:r>
+      <w:r>
+        <w:t xml:space="preserve">course without a neo.</w:t>
       </w:r>
     </w:p>
     <w:p>
@@ -4151,13 +4151,7 @@
         <w:t xml:space="preserve"> </w:t>
       </w:r>
       <w:r>
-        <w:t xml:space="preserve">away counts only about a seventh. After 1,000 iterations with it (and entropy</w:t>
-      </w:r>
-      <w:r>
-        <w:t xml:space="preserve"> </w:t>
-      </w:r>
-      <w:r>
-        <w:t xml:space="preserve">0.01) (</w:t>
+        <w:t xml:space="preserve">away counts only a seventh: after 1,000 iterations (</w:t>
       </w:r>
       <w:r>
         <w:rPr>
@@ -4166,19 +4160,13 @@
         <w:t xml:space="preserve">neo-stall</w:t>
       </w:r>
       <w:r>
-        <w:t xml:space="preserve">), the policy still makes none of the 13 types. Exploration</w:t>
-      </w:r>
-      <w:r>
-        <w:t xml:space="preserve"> </w:t>
-      </w:r>
-      <w:r>
-        <w:t xml:space="preserve">almost never finds the curved run a neo needs, so we gave the agent searched</w:t>
-      </w:r>
-      <w:r>
-        <w:t xml:space="preserve"> </w:t>
-      </w:r>
-      <w:r>
-        <w:t xml:space="preserve">landings as demonstrations.</w:t>
+        <w:t xml:space="preserve">) the policy</w:t>
+      </w:r>
+      <w:r>
+        <w:t xml:space="preserve"> </w:t>
+      </w:r>
+      <w:r>
+        <w:t xml:space="preserve">still makes none of the 13 types, so we gave it searched landings.</w:t>
       </w:r>
     </w:p>
     <w:p>
@@ -4286,116 +4274,36 @@
         <w:t xml:space="preserve"> </w:t>
       </w:r>
       <w:r>
-        <w:t xml:space="preserve">earlier ones and trains for 500 iterations. Two fixes were needed.</w:t>
-      </w:r>
-    </w:p>
-    <w:p>
-      <w:pPr>
-        <w:pStyle w:val="Compact"/>
-        <w:numPr>
-          <w:ilvl w:val="0"/>
-          <w:numId w:val="1004"/>
-        </w:numPr>
-      </w:pPr>
-      <w:r>
-        <w:rPr>
-          <w:i/>
-          <w:iCs/>
-        </w:rPr>
-        <w:t xml:space="preserve">Label noise.</w:t>
-      </w:r>
-      <w:r>
-        <w:t xml:space="preserve"> </w:t>
-      </w:r>
-      <w:r>
-        <w:t xml:space="preserve">The first attempt collapsed (from 86.5% to 5% on levels 0</w:t>
-      </w:r>
-      <w:r>
-        <w:t xml:space="preserve"> </w:t>
-      </w:r>
-      <w:r>
-        <w:t xml:space="preserve">to 8): the search filled ticks where the action does not matter with</w:t>
-      </w:r>
-      <w:r>
-        <w:t xml:space="preserve"> </w:t>
-      </w:r>
-      <w:r>
-        <w:t xml:space="preserve">random actions. It now starts from the policy’s own action probabilities</w:t>
-      </w:r>
-      <w:r>
-        <w:t xml:space="preserve"> </w:t>
-      </w:r>
-      <w:r>
-        <w:t xml:space="preserve">and puts the policy’s choice back wherever the neo still lands. The fixed</w:t>
-      </w:r>
-      <w:r>
-        <w:t xml:space="preserve"> </w:t>
-      </w:r>
-      <w:r>
-        <w:t xml:space="preserve">rounds also cut the imitation weight from 1 to 0.3, a confound, though</w:t>
-      </w:r>
-      <w:r>
-        <w:t xml:space="preserve"> </w:t>
-      </w:r>
-      <w:r>
-        <w:rPr>
-          <w:rStyle w:val="VerbatimChar"/>
-        </w:rPr>
-        <w:t xml:space="preserve">neo-bc</w:t>
-      </w:r>
-      <w:r>
-        <w:t xml:space="preserve"> </w:t>
-      </w:r>
-      <w:r>
-        <w:t xml:space="preserve">did not collapse at 1.</w:t>
-      </w:r>
-    </w:p>
-    <w:p>
-      <w:pPr>
-        <w:pStyle w:val="Compact"/>
-        <w:numPr>
-          <w:ilvl w:val="0"/>
-          <w:numId w:val="1004"/>
-        </w:numPr>
-      </w:pPr>
-      <w:r>
-        <w:rPr>
-          <w:i/>
-          <w:iCs/>
-        </w:rPr>
-        <w:t xml:space="preserve">Neo detection.</w:t>
-      </w:r>
-      <w:r>
-        <w:t xml:space="preserve"> </w:t>
-      </w:r>
-      <w:r>
-        <w:t xml:space="preserve">Round 1 also counted one-block-up jumps as neo takeoffs</w:t>
-      </w:r>
-      <w:r>
-        <w:t xml:space="preserve"> </w:t>
-      </w:r>
-      <w:r>
-        <w:t xml:space="preserve">(</w:t>
-      </w:r>
-      <w:r>
-        <w:rPr>
-          <w:rStyle w:val="VerbatimChar"/>
-        </w:rPr>
-        <w:t xml:space="preserve">results/neo/detector_check.json</w:t>
-      </w:r>
-      <w:r>
-        <w:t xml:space="preserve">, which calls it round 2); from round 2</w:t>
-      </w:r>
-      <w:r>
-        <w:t xml:space="preserve"> </w:t>
-      </w:r>
-      <w:r>
-        <w:t xml:space="preserve">on, only wall blocks count.</w:t>
-      </w:r>
-    </w:p>
-    <w:p>
-      <w:pPr>
-        <w:pStyle w:val="FirstParagraph"/>
+        <w:t xml:space="preserve">earlier ones and trains for 500 iterations. A first attempt collapsed (from</w:t>
+      </w:r>
+      <w:r>
+        <w:t xml:space="preserve"> </w:t>
+      </w:r>
+      <w:r>
+        <w:t xml:space="preserve">86.5% to 5% on levels 0 to 8): the search filled ticks where the action does</w:t>
+      </w:r>
+      <w:r>
+        <w:t xml:space="preserve"> </w:t>
+      </w:r>
+      <w:r>
+        <w:t xml:space="preserve">not matter with random actions. It now starts from the policy’s own action</w:t>
+      </w:r>
+      <w:r>
+        <w:t xml:space="preserve"> </w:t>
+      </w:r>
+      <w:r>
+        <w:t xml:space="preserve">probabilities and puts the policy’s choice back wherever the neo still lands</w:t>
+      </w:r>
+      <w:r>
+        <w:t xml:space="preserve"> </w:t>
+      </w:r>
+      <w:r>
+        <w:t xml:space="preserve">(the fixed rounds also cut the imitation weight from 1 to 0.3, a confound).</w:t>
+      </w:r>
+    </w:p>
+    <w:p>
+      <w:pPr>
+        <w:pStyle w:val="BodyText"/>
       </w:pPr>
       <w:r>
         <w:t xml:space="preserve">Results on the 210 test courses of levels 6 to 8 with a neo (337 neo jumps,</w:t>
@@ -4855,19 +4763,7 @@
         <w:t xml:space="preserve"> </w:t>
       </w:r>
       <w:r>
-        <w:t xml:space="preserve">the 218 validation neo courses (67.4%; 145 of them taking every neo; alone,</w:t>
-      </w:r>
-      <w:r>
-        <w:t xml:space="preserve"> </w:t>
-      </w:r>
-      <w:r>
-        <w:t xml:space="preserve">0). Also planning the approach to each takeoff gives 157, but 36 of those</w:t>
-      </w:r>
-      <w:r>
-        <w:t xml:space="preserve"> </w:t>
-      </w:r>
-      <w:r>
-        <w:t xml:space="preserve">skip a neo’s takeoff. Its test is on hold.</w:t>
+        <w:t xml:space="preserve">the 218 validation neo courses (67.4%; alone, 0).</w:t>
       </w:r>
     </w:p>
     <w:p>
@@ -4912,43 +4808,31 @@
         <w:t xml:space="preserve"> </w:t>
       </w:r>
       <w:r>
-        <w:t xml:space="preserve">(84.7%) with the final policy, 267 with the neo policy; up to three search</w:t>
-      </w:r>
-      <w:r>
-        <w:t xml:space="preserve"> </w:t>
-      </w:r>
-      <w:r>
-        <w:t xml:space="preserve">restarts lifted the former to 286 (89.4%), past the 89% (85% plus two standard</w:t>
-      </w:r>
-      <w:r>
-        <w:t xml:space="preserve"> </w:t>
-      </w:r>
-      <w:r>
-        <w:t xml:space="preserve">errors) at which the trials stopped. Played once, this setting completes 276</w:t>
-      </w:r>
-      <w:r>
-        <w:t xml:space="preserve"> </w:t>
-      </w:r>
-      <w:r>
-        <w:t xml:space="preserve">of 320 test courses (86.25%), against 137 (42.8%) for the best policy alone.</w:t>
-      </w:r>
-      <w:r>
-        <w:t xml:space="preserve"> </w:t>
-      </w:r>
-      <w:r>
-        <w:t xml:space="preserve">The goal is met, narrowly: the search seed alone gives a 320-course count a</w:t>
-      </w:r>
-      <w:r>
-        <w:t xml:space="preserve"> </w:t>
-      </w:r>
-      <w:r>
-        <w:t xml:space="preserve">standard deviation of about 7 to 11 courses (three settings), so 86.25% is one</w:t>
-      </w:r>
-      <w:r>
-        <w:t xml:space="preserve"> </w:t>
-      </w:r>
-      <w:r>
-        <w:t xml:space="preserve">draw and its 4-course margin lies within that noise.</w:t>
+        <w:t xml:space="preserve">(84.7%) with the final policy; up to three search restarts lifted it to 286</w:t>
+      </w:r>
+      <w:r>
+        <w:t xml:space="preserve"> </w:t>
+      </w:r>
+      <w:r>
+        <w:t xml:space="preserve">(89.4%), past the 89% (85% plus two standard errors) at which the trials</w:t>
+      </w:r>
+      <w:r>
+        <w:t xml:space="preserve"> </w:t>
+      </w:r>
+      <w:r>
+        <w:t xml:space="preserve">stopped. Played once, this setting completes 276 of 320 test courses</w:t>
+      </w:r>
+      <w:r>
+        <w:t xml:space="preserve"> </w:t>
+      </w:r>
+      <w:r>
+        <w:t xml:space="preserve">(86.25%), against 137 (42.8%) for the best policy alone: the goal is met,</w:t>
+      </w:r>
+      <w:r>
+        <w:t xml:space="preserve"> </w:t>
+      </w:r>
+      <w:r>
+        <w:t xml:space="preserve">narrowly, since the search seed alone moves a count by 7 to 11 courses.</w:t>
       </w:r>
     </w:p>
     <w:tbl>
@@ -4959,9 +4843,10 @@
         <w:tblLook w:firstRow="1" w:lastRow="0" w:firstColumn="0" w:lastColumn="0" w:noHBand="0" w:noVBand="0" w:val="0020"/>
       </w:tblPr>
       <w:tblGrid>
-        <w:gridCol w:w="2640"/>
-        <w:gridCol w:w="2640"/>
-        <w:gridCol w:w="2640"/>
+        <w:gridCol w:w="1980"/>
+        <w:gridCol w:w="1980"/>
+        <w:gridCol w:w="1980"/>
+        <w:gridCol w:w="1980"/>
       </w:tblGrid>
       <w:tr>
         <w:trPr>
@@ -4999,6 +4884,18 @@
               <w:spacing w:line="240" w:lineRule="auto"/>
             </w:pPr>
             <w:r>
+              <w:t xml:space="preserve">Final policy + neo skill: first, after DAgger</w:t>
+            </w:r>
+          </w:p>
+        </w:tc>
+        <w:tc>
+          <w:tcPr/>
+          <w:p>
+            <w:pPr>
+              <w:pStyle w:val="Compact"/>
+              <w:spacing w:line="240" w:lineRule="auto"/>
+            </w:pPr>
+            <w:r>
               <w:t xml:space="preserve">Best policy alone (DAgger round 4)</w:t>
             </w:r>
           </w:p>
@@ -5037,7 +4934,19 @@
               <w:spacing w:line="240" w:lineRule="auto"/>
             </w:pPr>
             <w:r>
-              <w:t xml:space="preserve">146 (45.6%), best of 10 snapshots</w:t>
+              <w:t xml:space="preserve">283; 287 (89.7%), best of 62</w:t>
+            </w:r>
+          </w:p>
+        </w:tc>
+        <w:tc>
+          <w:tcPr/>
+          <w:p>
+            <w:pPr>
+              <w:pStyle w:val="Compact"/>
+              <w:spacing w:line="240" w:lineRule="auto"/>
+            </w:pPr>
+            <w:r>
+              <w:t xml:space="preserve">146 (45.6%), best of 10</w:t>
             </w:r>
           </w:p>
         </w:tc>
@@ -5075,6 +4984,18 @@
               <w:spacing w:line="240" w:lineRule="auto"/>
             </w:pPr>
             <w:r>
+              <w:t xml:space="preserve">264 (82.5%); 280 additional</w:t>
+            </w:r>
+          </w:p>
+        </w:tc>
+        <w:tc>
+          <w:tcPr/>
+          <w:p>
+            <w:pPr>
+              <w:pStyle w:val="Compact"/>
+              <w:spacing w:line="240" w:lineRule="auto"/>
+            </w:pPr>
+            <w:r>
               <w:t xml:space="preserve">137 (42.8%)</w:t>
             </w:r>
           </w:p>
@@ -5089,31 +5010,43 @@
               <w:spacing w:line="240" w:lineRule="auto"/>
             </w:pPr>
             <w:r>
-              <w:t xml:space="preserve">first 64 test courses, offline bot and real Minecraft</w:t>
-            </w:r>
-          </w:p>
-        </w:tc>
-        <w:tc>
-          <w:tcPr/>
-          <w:p>
-            <w:pPr>
-              <w:pStyle w:val="Compact"/>
-              <w:spacing w:line="240" w:lineRule="auto"/>
-            </w:pPr>
-            <w:r>
-              <w:t xml:space="preserve">58/64 and 58/64</w:t>
-            </w:r>
-          </w:p>
-        </w:tc>
-        <w:tc>
-          <w:tcPr/>
-          <w:p>
-            <w:pPr>
-              <w:pStyle w:val="Compact"/>
-              <w:spacing w:line="240" w:lineRule="auto"/>
-            </w:pPr>
-            <w:r>
-              <w:t xml:space="preserve">26/64 and 26/64</w:t>
+              <w:t xml:space="preserve">320 fresh test (family 49), played once</w:t>
+            </w:r>
+          </w:p>
+        </w:tc>
+        <w:tc>
+          <w:tcPr/>
+          <w:p>
+            <w:pPr>
+              <w:pStyle w:val="Compact"/>
+              <w:spacing w:line="240" w:lineRule="auto"/>
+            </w:pPr>
+            <w:r>
+              <w:t xml:space="preserve">288 (90.0%)</w:t>
+            </w:r>
+          </w:p>
+        </w:tc>
+        <w:tc>
+          <w:tcPr/>
+          <w:p>
+            <w:pPr>
+              <w:pStyle w:val="Compact"/>
+              <w:spacing w:line="240" w:lineRule="auto"/>
+            </w:pPr>
+            <w:r>
+              <w:t xml:space="preserve">276 (86.25%); 268 additional</w:t>
+            </w:r>
+          </w:p>
+        </w:tc>
+        <w:tc>
+          <w:tcPr/>
+          <w:p>
+            <w:pPr>
+              <w:pStyle w:val="Compact"/>
+              <w:spacing w:line="240" w:lineRule="auto"/>
+            </w:pPr>
+            <w:r>
+              <w:t xml:space="preserve">-</w:t>
             </w:r>
           </w:p>
         </w:tc>
@@ -5127,19 +5060,31 @@
               <w:spacing w:line="240" w:lineRule="auto"/>
             </w:pPr>
             <w:r>
-              <w:t xml:space="preserve">the same, with both fixes below</w:t>
-            </w:r>
-          </w:p>
-        </w:tc>
-        <w:tc>
-          <w:tcPr/>
-          <w:p>
-            <w:pPr>
-              <w:pStyle w:val="Compact"/>
-              <w:spacing w:line="240" w:lineRule="auto"/>
-            </w:pPr>
-            <w:r>
-              <w:t xml:space="preserve">55/64 and 55/64</w:t>
+              <w:t xml:space="preserve">320 fresh test (family 50), played once</w:t>
+            </w:r>
+          </w:p>
+        </w:tc>
+        <w:tc>
+          <w:tcPr/>
+          <w:p>
+            <w:pPr>
+              <w:pStyle w:val="Compact"/>
+              <w:spacing w:line="240" w:lineRule="auto"/>
+            </w:pPr>
+            <w:r>
+              <w:t xml:space="preserve">284 (88.75%)</w:t>
+            </w:r>
+          </w:p>
+        </w:tc>
+        <w:tc>
+          <w:tcPr/>
+          <w:p>
+            <w:pPr>
+              <w:pStyle w:val="Compact"/>
+              <w:spacing w:line="240" w:lineRule="auto"/>
+            </w:pPr>
+            <w:r>
+              <w:t xml:space="preserve">277 (86.6%)</w:t>
             </w:r>
           </w:p>
         </w:tc>
@@ -5152,6 +5097,56 @@
             </w:pPr>
             <w:r>
               <w:t xml:space="preserve">-</w:t>
+            </w:r>
+          </w:p>
+        </w:tc>
+      </w:tr>
+      <w:tr>
+        <w:tc>
+          <w:tcPr/>
+          <w:p>
+            <w:pPr>
+              <w:pStyle w:val="Compact"/>
+              <w:spacing w:line="240" w:lineRule="auto"/>
+            </w:pPr>
+            <w:r>
+              <w:t xml:space="preserve">first 64 test courses, offline bot and real Minecraft</w:t>
+            </w:r>
+          </w:p>
+        </w:tc>
+        <w:tc>
+          <w:tcPr/>
+          <w:p>
+            <w:pPr>
+              <w:pStyle w:val="Compact"/>
+              <w:spacing w:line="240" w:lineRule="auto"/>
+            </w:pPr>
+            <w:r>
+              <w:t xml:space="preserve">58/64, 58/64; 55/64, 55/64 after both fixes</w:t>
+            </w:r>
+          </w:p>
+        </w:tc>
+        <w:tc>
+          <w:tcPr/>
+          <w:p>
+            <w:pPr>
+              <w:pStyle w:val="Compact"/>
+              <w:spacing w:line="240" w:lineRule="auto"/>
+            </w:pPr>
+            <w:r>
+              <w:t xml:space="preserve">59/64, 59/64 after DAgger</w:t>
+            </w:r>
+          </w:p>
+        </w:tc>
+        <w:tc>
+          <w:tcPr/>
+          <w:p>
+            <w:pPr>
+              <w:pStyle w:val="Compact"/>
+              <w:spacing w:line="240" w:lineRule="auto"/>
+            </w:pPr>
+            <w:r>
+              <w:t xml:space="preserve">26/64, 26/64</w:t>
             </w:r>
           </w:p>
         </w:tc>
@@ -5184,49 +5179,34 @@
         <w:t xml:space="preserve"> </w:t>
       </w:r>
       <w:r>
-        <w:t xml:space="preserve">6). Two changes followed, prompted by these runs and kept on validation. With the first-jump fix, which also plans from the start state,</w:t>
-      </w:r>
-      <w:r>
-        <w:t xml:space="preserve"> </w:t>
-      </w:r>
-      <w:r>
-        <w:t xml:space="preserve">the server corrected the bot twice and one course failed (54/64; 55</w:t>
-      </w:r>
-      <w:r>
-        <w:t xml:space="preserve"> </w:t>
-      </w:r>
-      <w:r>
-        <w:t xml:space="preserve">offline). Both came at a neo wall’s corner: the game resolves horizontal</w:t>
-      </w:r>
-      <w:r>
-        <w:t xml:space="preserve"> </w:t>
-      </w:r>
-      <w:r>
-        <w:t xml:space="preserve">movement along its larger component first, prismarine-physics along x then</w:t>
-      </w:r>
-      <w:r>
-        <w:t xml:space="preserve"> </w:t>
-      </w:r>
-      <w:r>
-        <w:t xml:space="preserve">z, and the server sends the bot back when the two end over 0.25 blocks</w:t>
-      </w:r>
-      <w:r>
-        <w:t xml:space="preserve"> </w:t>
-      </w:r>
-      <w:r>
-        <w:t xml:space="preserve">apart and the bot’s box started the tick clear of blocks. This rule matches</w:t>
-      </w:r>
-      <w:r>
-        <w:t xml:space="preserve"> </w:t>
-      </w:r>
-      <w:r>
-        <w:t xml:space="preserve">every warning and send-back in 40 recorded real-game runs</w:t>
-      </w:r>
-      <w:r>
-        <w:t xml:space="preserve"> </w:t>
-      </w:r>
-      <w:r>
-        <w:t xml:space="preserve">(</w:t>
+        <w:t xml:space="preserve">6). Two changes followed, kept on validation: the first jump is planned</w:t>
+      </w:r>
+      <w:r>
+        <w:t xml:space="preserve"> </w:t>
+      </w:r>
+      <w:r>
+        <w:t xml:space="preserve">too, and plans are dropped that drift over 0.25 blocks past a neo wall’s</w:t>
+      </w:r>
+      <w:r>
+        <w:t xml:space="preserve"> </w:t>
+      </w:r>
+      <w:r>
+        <w:t xml:space="preserve">corner in the game’s collision order (the game resolves horizontal movement</w:t>
+      </w:r>
+      <w:r>
+        <w:t xml:space="preserve"> </w:t>
+      </w:r>
+      <w:r>
+        <w:t xml:space="preserve">along its larger component first, prismarine-physics x then z; this rule</w:t>
+      </w:r>
+      <w:r>
+        <w:t xml:space="preserve"> </w:t>
+      </w:r>
+      <w:r>
+        <w:t xml:space="preserve">matches every warning and send-back in 40 real-game runs,</w:t>
+      </w:r>
+      <w:r>
+        <w:t xml:space="preserve"> </w:t>
       </w:r>
       <w:r>
         <w:rPr>
@@ -5235,25 +5215,25 @@
         <w:t xml:space="preserve">results/corner_scan.json</w:t>
       </w:r>
       <w:r>
-        <w:t xml:space="preserve">). The corner check drops plans drifting over</w:t>
-      </w:r>
-      <w:r>
-        <w:t xml:space="preserve"> </w:t>
-      </w:r>
-      <w:r>
-        <w:t xml:space="preserve">0.25 blocks in the game’s order, at no cost on validation. After both, the</w:t>
-      </w:r>
-      <w:r>
-        <w:t xml:space="preserve"> </w:t>
-      </w:r>
-      <w:r>
-        <w:t xml:space="preserve">bots made 55/64 offline and in real Minecraft, the simulator’s courses and</w:t>
-      </w:r>
-      <w:r>
-        <w:t xml:space="preserve"> </w:t>
-      </w:r>
-      <w:r>
-        <w:t xml:space="preserve">ticks, with 0 corrections; 58 against 55 is within the search’s seed noise.</w:t>
+        <w:t xml:space="preserve">; with the first alone the server corrected the</w:t>
+      </w:r>
+      <w:r>
+        <w:t xml:space="preserve"> </w:t>
+      </w:r>
+      <w:r>
+        <w:t xml:space="preserve">bot twice, 54/64). With both, the bots made 55/64 offline and in</w:t>
+      </w:r>
+      <w:r>
+        <w:t xml:space="preserve"> </w:t>
+      </w:r>
+      <w:r>
+        <w:t xml:space="preserve">real Minecraft, the simulator’s courses and ticks, with 0 corrections; 58</w:t>
+      </w:r>
+      <w:r>
+        <w:t xml:space="preserve"> </w:t>
+      </w:r>
+      <w:r>
+        <w:t xml:space="preserve">against 55 is within the search’s seed noise.</w:t>
       </w:r>
     </w:p>
     <w:p>
@@ -5304,43 +5284,136 @@
         <w:t xml:space="preserve"> </w:t>
       </w:r>
       <w:r>
-        <w:t xml:space="preserve">land. Chosen on validation</w:t>
-      </w:r>
-      <w:r>
-        <w:t xml:space="preserve"> </w:t>
-      </w:r>
-      <w:r>
-        <w:t xml:space="preserve">(255, 257 and 251 of 320 over three search seeds) by rules fixed before the</w:t>
-      </w:r>
-      <w:r>
-        <w:t xml:space="preserve"> </w:t>
-      </w:r>
-      <w:r>
-        <w:t xml:space="preserve">runs, it completes 252 of the 320 test courses (78.75%, played once) against</w:t>
-      </w:r>
-      <w:r>
-        <w:t xml:space="preserve"> </w:t>
-      </w:r>
-      <w:r>
-        <w:t xml:space="preserve">276 with the course list, and 52 of the first 64 in the offline bot and in</w:t>
-      </w:r>
-      <w:r>
-        <w:t xml:space="preserve"> </w:t>
-      </w:r>
-      <w:r>
-        <w:t xml:space="preserve">real Minecraft, with 0 corrections (course list: 55). Planning also the</w:t>
-      </w:r>
-      <w:r>
-        <w:t xml:space="preserve"> </w:t>
-      </w:r>
-      <w:r>
-        <w:t xml:space="preserve">jumps that lead to a walled choice, kept by a later rule (278, 282 and 273 on</w:t>
-      </w:r>
-      <w:r>
-        <w:t xml:space="preserve"> </w:t>
-      </w:r>
-      <w:r>
-        <w:t xml:space="preserve">validation), gives 280 in an additional test and 59 of 64 in both bots.</w:t>
+        <w:t xml:space="preserve">land. Chosen on validation (255, 257 and 251 of 320 over three seeds), it</w:t>
+      </w:r>
+      <w:r>
+        <w:t xml:space="preserve"> </w:t>
+      </w:r>
+      <w:r>
+        <w:t xml:space="preserve">completes 252 of the 320 test courses (78.75%, played once), and 52 of the</w:t>
+      </w:r>
+      <w:r>
+        <w:t xml:space="preserve"> </w:t>
+      </w:r>
+      <w:r>
+        <w:t xml:space="preserve">first 64 in both bots with 0 corrections. Also planning the jumps that lead</w:t>
+      </w:r>
+      <w:r>
+        <w:t xml:space="preserve"> </w:t>
+      </w:r>
+      <w:r>
+        <w:t xml:space="preserve">to a walled choice (278, 282, 273 on validation) gives 280 in an additional</w:t>
+      </w:r>
+      <w:r>
+        <w:t xml:space="preserve"> </w:t>
+      </w:r>
+      <w:r>
+        <w:t xml:space="preserve">test and 59 of 64 in both bots.</w:t>
+      </w:r>
+    </w:p>
+    <w:p>
+      <w:pPr>
+        <w:pStyle w:val="BodyText"/>
+      </w:pPr>
+      <w:r>
+        <w:rPr>
+          <w:b/>
+          <w:bCs/>
+        </w:rPr>
+        <w:t xml:space="preserve">Without the search: a learned neo skill.</w:t>
+      </w:r>
+      <w:r>
+        <w:t xml:space="preserve"> </w:t>
+      </w:r>
+      <w:r>
+        <w:t xml:space="preserve">A second network plays the</w:t>
+      </w:r>
+      <w:r>
+        <w:t xml:space="preserve"> </w:t>
+      </w:r>
+      <w:r>
+        <w:t xml:space="preserve">block around each neo, from the first landing on the platform before the</w:t>
+      </w:r>
+      <w:r>
+        <w:t xml:space="preserve"> </w:t>
+      </w:r>
+      <w:r>
+        <w:t xml:space="preserve">takeoff to the first landing after the target, handed over by a fixed gate,</w:t>
+      </w:r>
+      <w:r>
+        <w:t xml:space="preserve"> </w:t>
+      </w:r>
+      <w:r>
+        <w:t xml:space="preserve">the neo detector. PPO trains it on that block alone, each episode starting</w:t>
+      </w:r>
+      <w:r>
+        <w:t xml:space="preserve"> </w:t>
+      </w:r>
+      <w:r>
+        <w:t xml:space="preserve">in the exact state in which the final policy first stands there, on 63,777</w:t>
+      </w:r>
+      <w:r>
+        <w:t xml:space="preserve"> </w:t>
+      </w:r>
+      <w:r>
+        <w:t xml:space="preserve">training courses (</w:t>
+      </w:r>
+      <w:r>
+        <w:rPr>
+          <w:rStyle w:val="VerbatimChar"/>
+        </w:rPr>
+        <w:t xml:space="preserve">parkour/neo_skill.py</w:t>
+      </w:r>
+      <w:r>
+        <w:t xml:space="preserve">). The first version (best of 37</w:t>
+      </w:r>
+      <w:r>
+        <w:t xml:space="preserve"> </w:t>
+      </w:r>
+      <w:r>
+        <w:t xml:space="preserve">snapshots) completes 264 test courses (82.5%), short of the goal: on four</w:t>
+      </w:r>
+      <w:r>
+        <w:t xml:space="preserve"> </w:t>
+      </w:r>
+      <w:r>
+        <w:t xml:space="preserve">types with the wall in the first gap cell it stood still. Two DAgger rounds</w:t>
+      </w:r>
+      <w:r>
+        <w:t xml:space="preserve"> </w:t>
+      </w:r>
+      <w:r>
+        <w:t xml:space="preserve">then imitated the planner’s landings from its own states on those types.</w:t>
+      </w:r>
+      <w:r>
+        <w:t xml:space="preserve"> </w:t>
+      </w:r>
+      <w:r>
+        <w:t xml:space="preserve">The best of all 62 candidates completes 277 of a fresh test set (86.6%,</w:t>
+      </w:r>
+      <w:r>
+        <w:t xml:space="preserve"> </w:t>
+      </w:r>
+      <w:r>
+        <w:t xml:space="preserve">played once; 280 with the router’s walled choice as the gate) and 85.9% of</w:t>
+      </w:r>
+      <w:r>
+        <w:t xml:space="preserve"> </w:t>
+      </w:r>
+      <w:r>
+        <w:t xml:space="preserve">all 960 test courses. It loses about as many neos as the search but more</w:t>
+      </w:r>
+      <w:r>
+        <w:t xml:space="preserve"> </w:t>
+      </w:r>
+      <w:r>
+        <w:t xml:space="preserve">ordinary jumps, which the planner plans and the skill leaves to the final</w:t>
+      </w:r>
+      <w:r>
+        <w:t xml:space="preserve"> </w:t>
+      </w:r>
+      <w:r>
+        <w:t xml:space="preserve">policy.</w:t>
       </w:r>
     </w:p>
     <w:p>
@@ -6503,49 +6576,43 @@
         <w:t xml:space="preserve"> </w:t>
       </w:r>
       <w:r>
-        <w:t xml:space="preserve">PPO never found a neo by exploring. Imitating</w:t>
-      </w:r>
-      <w:r>
-        <w:t xml:space="preserve"> </w:t>
-      </w:r>
-      <w:r>
-        <w:t xml:space="preserve">a search expert, then DAgger, taught the jump, but on the single-neo test</w:t>
-      </w:r>
-      <w:r>
-        <w:t xml:space="preserve"> </w:t>
-      </w:r>
-      <w:r>
-        <w:t xml:space="preserve">courses the best policy alone completes 42.8%, while the neo planner, the</w:t>
-      </w:r>
-      <w:r>
-        <w:t xml:space="preserve"> </w:t>
-      </w:r>
-      <w:r>
-        <w:t xml:space="preserve">same kind of search run at each takeoff during play, completes 86.25%</w:t>
-      </w:r>
-      <w:r>
-        <w:t xml:space="preserve"> </w:t>
-      </w:r>
-      <w:r>
-        <w:t xml:space="preserve">(strict, simulator, played once; section 7.8). Both need a simulator exact</w:t>
-      </w:r>
-      <w:r>
-        <w:t xml:space="preserve"> </w:t>
-      </w:r>
-      <w:r>
-        <w:t xml:space="preserve">and cheap enough to search from any state. The price is search time at</w:t>
-      </w:r>
-      <w:r>
-        <w:t xml:space="preserve"> </w:t>
-      </w:r>
-      <w:r>
-        <w:t xml:space="preserve">every takeoff (2.8 s per search on the CPU in the test), and a skill that is</w:t>
-      </w:r>
-      <w:r>
-        <w:t xml:space="preserve"> </w:t>
-      </w:r>
-      <w:r>
-        <w:t xml:space="preserve">planned rather than learned.</w:t>
+        <w:t xml:space="preserve">PPO never found a neo by exploring whole</w:t>
+      </w:r>
+      <w:r>
+        <w:t xml:space="preserve"> </w:t>
+      </w:r>
+      <w:r>
+        <w:t xml:space="preserve">courses, and imitation plus DAgger gave 42.8% of the single-neo test courses</w:t>
+      </w:r>
+      <w:r>
+        <w:t xml:space="preserve"> </w:t>
+      </w:r>
+      <w:r>
+        <w:t xml:space="preserve">against the planner’s 86.25% (section 7.8). PPO closed most of the gap once</w:t>
+      </w:r>
+      <w:r>
+        <w:t xml:space="preserve"> </w:t>
+      </w:r>
+      <w:r>
+        <w:t xml:space="preserve">its episodes were only the neo’s block, started where the final policy</w:t>
+      </w:r>
+      <w:r>
+        <w:t xml:space="preserve"> </w:t>
+      </w:r>
+      <w:r>
+        <w:t xml:space="preserve">really arrives, plus DAgger from the planner on the hardest types: 86.6% of</w:t>
+      </w:r>
+      <w:r>
+        <w:t xml:space="preserve"> </w:t>
+      </w:r>
+      <w:r>
+        <w:t xml:space="preserve">a fresh test set with no search. What changed is where episodes start, not</w:t>
+      </w:r>
+      <w:r>
+        <w:t xml:space="preserve"> </w:t>
+      </w:r>
+      <w:r>
+        <w:t xml:space="preserve">the algorithm.</w:t>
       </w:r>
     </w:p>
     <w:p>
@@ -6619,6 +6686,322 @@
         </w:rPr>
         <w:t xml:space="preserve">Limitations.</w:t>
       </w:r>
+    </w:p>
+    <w:p>
+      <w:pPr>
+        <w:pStyle w:val="Compact"/>
+        <w:numPr>
+          <w:ilvl w:val="0"/>
+          <w:numId w:val="1004"/>
+        </w:numPr>
+      </w:pPr>
+      <w:r>
+        <w:t xml:space="preserve">The final policy trained on stone only; the other blocks are opt-in</w:t>
+      </w:r>
+      <w:r>
+        <w:t xml:space="preserve"> </w:t>
+      </w:r>
+      <w:r>
+        <w:t xml:space="preserve">(section 3), and water is not modelled.</w:t>
+      </w:r>
+    </w:p>
+    <w:p>
+      <w:pPr>
+        <w:pStyle w:val="Compact"/>
+        <w:numPr>
+          <w:ilvl w:val="0"/>
+          <w:numId w:val="1004"/>
+        </w:numPr>
+      </w:pPr>
+      <w:r>
+        <w:t xml:space="preserve">The feasibility study uses scripted strategies from rest, so it</w:t>
+      </w:r>
+      <w:r>
+        <w:t xml:space="preserve"> </w:t>
+      </w:r>
+      <w:r>
+        <w:t xml:space="preserve">underestimates what is possible (section 7.4) and what chained jumps allow.</w:t>
+      </w:r>
+    </w:p>
+    <w:p>
+      <w:pPr>
+        <w:pStyle w:val="Compact"/>
+        <w:numPr>
+          <w:ilvl w:val="0"/>
+          <w:numId w:val="1004"/>
+        </w:numPr>
+      </w:pPr>
+      <w:r>
+        <w:t xml:space="preserve">Courses are built and reset with server commands (section 6); a carpet</w:t>
+      </w:r>
+      <w:r>
+        <w:t xml:space="preserve"> </w:t>
+      </w:r>
+      <w:r>
+        <w:t xml:space="preserve">over air breaks in the game, so the bot puts a structure void under it.</w:t>
+      </w:r>
+    </w:p>
+    <w:p>
+      <w:pPr>
+        <w:pStyle w:val="Compact"/>
+        <w:numPr>
+          <w:ilvl w:val="0"/>
+          <w:numId w:val="1004"/>
+        </w:numPr>
+      </w:pPr>
+      <w:r>
+        <w:t xml:space="preserve">With the neo planner the bot pauses while it searches, so those episodes</w:t>
+      </w:r>
+      <w:r>
+        <w:t xml:space="preserve"> </w:t>
+      </w:r>
+      <w:r>
+        <w:t xml:space="preserve">are not in real time.</w:t>
+      </w:r>
+    </w:p>
+    <w:p>
+      <w:pPr>
+        <w:pStyle w:val="Compact"/>
+        <w:numPr>
+          <w:ilvl w:val="0"/>
+          <w:numId w:val="1004"/>
+        </w:numPr>
+      </w:pPr>
+      <w:r>
+        <w:t xml:space="preserve">Runs used an RTX 5080 and, for the learned router, the teammate’s RTX</w:t>
+      </w:r>
+      <w:r>
+        <w:t xml:space="preserve"> </w:t>
+      </w:r>
+      <w:r>
+        <w:t xml:space="preserve">4060 Ti.</w:t>
+      </w:r>
+    </w:p>
+    <w:p>
+      <w:pPr>
+        <w:pStyle w:val="Heading2"/>
+      </w:pPr>
+      <w:bookmarkStart w:id="40" w:name="_conclusion"/>
+      <w:r>
+        <w:t xml:space="preserve">9. Conclusion</w:t>
+      </w:r>
+      <w:bookmarkEnd w:id="40"/>
+    </w:p>
+    <w:p>
+      <w:pPr>
+        <w:pStyle w:val="FirstParagraph"/>
+      </w:pPr>
+      <w:r>
+        <w:t xml:space="preserve">A PPO agent trained on generated courses, in a simulator that reproduces a</w:t>
+      </w:r>
+      <w:r>
+        <w:t xml:space="preserve"> </w:t>
+      </w:r>
+      <w:r>
+        <w:t xml:space="preserve">Mineflayer bot’s movement engine, completes parkour courses it has never</w:t>
+      </w:r>
+      <w:r>
+        <w:t xml:space="preserve"> </w:t>
+      </w:r>
+      <w:r>
+        <w:t xml:space="preserve">seen: 98.4% of 1,200 held-out standard courses and 95.2% of 1,200 obstacle</w:t>
+      </w:r>
+      <w:r>
+        <w:t xml:space="preserve"> </w:t>
+      </w:r>
+      <w:r>
+        <w:t xml:space="preserve">courses (simulator; level 5: 93.5% and 81.0%). In real Minecraft the bot</w:t>
+      </w:r>
+      <w:r>
+        <w:t xml:space="preserve"> </w:t>
+      </w:r>
+      <w:r>
+        <w:t xml:space="preserve">made exactly the simulator’s courses (59 of 60 standard, 57 of 60</w:t>
+      </w:r>
+      <w:r>
+        <w:t xml:space="preserve"> </w:t>
+      </w:r>
+      <w:r>
+        <w:t xml:space="preserve">obstacle), with 0 server corrections and replays within 2.1e-14 blocks of</w:t>
+      </w:r>
+      <w:r>
+        <w:t xml:space="preserve"> </w:t>
+      </w:r>
+      <w:r>
+        <w:t xml:space="preserve">the game. Away from wall corners, where the game orders collisions</w:t>
+      </w:r>
+      <w:r>
+        <w:t xml:space="preserve"> </w:t>
+      </w:r>
+      <w:r>
+        <w:t xml:space="preserve">differently, the gap in movement between simulation and the game is</w:t>
+      </w:r>
+      <w:r>
+        <w:t xml:space="preserve"> </w:t>
+      </w:r>
+      <w:r>
+        <w:t xml:space="preserve">rounding error.</w:t>
+      </w:r>
+    </w:p>
+    <w:p>
+      <w:pPr>
+        <w:pStyle w:val="BodyText"/>
+      </w:pPr>
+      <w:r>
+        <w:t xml:space="preserve">Of our first reward ideas, the fall penalty mattered most (level 5: 72.0%</w:t>
+      </w:r>
+      <w:r>
+        <w:t xml:space="preserve"> </w:t>
+      </w:r>
+      <w:r>
+        <w:t xml:space="preserve">against 55.2%) and distance shaping made learning about three times faster;</w:t>
+      </w:r>
+      <w:r>
+        <w:t xml:space="preserve"> </w:t>
+      </w:r>
+      <w:r>
+        <w:t xml:space="preserve">neither the landing bonus nor the curriculum changed the final score</w:t>
+      </w:r>
+      <w:r>
+        <w:t xml:space="preserve"> </w:t>
+      </w:r>
+      <w:r>
+        <w:t xml:space="preserve">reliably. On neo jumps, which random tries rarely land, the same penalty</w:t>
+      </w:r>
+      <w:r>
+        <w:t xml:space="preserve"> </w:t>
+      </w:r>
+      <w:r>
+        <w:t xml:space="preserve">made refusing cheaper than trying: PPO alone never made one. Search</w:t>
+      </w:r>
+      <w:r>
+        <w:t xml:space="preserve"> </w:t>
+      </w:r>
+      <w:r>
+        <w:t xml:space="preserve">demonstrations and DAgger raised the completed level 6-8 neo test courses</w:t>
+      </w:r>
+      <w:r>
+        <w:t xml:space="preserve"> </w:t>
+      </w:r>
+      <w:r>
+        <w:t xml:space="preserve">from 0 to 29.0% (simulator). Searching each takeoff at play time with the</w:t>
+      </w:r>
+      <w:r>
+        <w:t xml:space="preserve"> </w:t>
+      </w:r>
+      <w:r>
+        <w:t xml:space="preserve">exact simulator met the 85% single-neo goal, narrowly: 276 of 320 test</w:t>
+      </w:r>
+      <w:r>
+        <w:t xml:space="preserve"> </w:t>
+      </w:r>
+      <w:r>
+        <w:t xml:space="preserve">courses (86.25%, strict, simulator, played once) against 42.8% for the best</w:t>
+      </w:r>
+      <w:r>
+        <w:t xml:space="preserve"> </w:t>
+      </w:r>
+      <w:r>
+        <w:t xml:space="preserve">policy alone; in real Minecraft the bot made the simulator’s courses on the</w:t>
+      </w:r>
+      <w:r>
+        <w:t xml:space="preserve"> </w:t>
+      </w:r>
+      <w:r>
+        <w:t xml:space="preserve">first 64 of them (58, then 55 after two later fixes; section 7.8), with 0</w:t>
+      </w:r>
+      <w:r>
+        <w:t xml:space="preserve"> </w:t>
+      </w:r>
+      <w:r>
+        <w:t xml:space="preserve">corrections. With no search, a neo skill trained by PPO on the neo’s block</w:t>
+      </w:r>
+      <w:r>
+        <w:t xml:space="preserve"> </w:t>
+      </w:r>
+      <w:r>
+        <w:t xml:space="preserve">alone, then DAgger, completes 86.6% of a fresh test set (85.9% of 960).</w:t>
+      </w:r>
+    </w:p>
+    <w:p>
+      <w:pPr>
+        <w:pStyle w:val="BodyText"/>
+      </w:pPr>
+      <w:r>
+        <w:t xml:space="preserve">Without the course list, a learned router trained with PPO plus an</w:t>
+      </w:r>
+      <w:r>
+        <w:t xml:space="preserve"> </w:t>
+      </w:r>
+      <w:r>
+        <w:t xml:space="preserve">imitation term towards the course’s next platform picks each platform from</w:t>
+      </w:r>
+      <w:r>
+        <w:t xml:space="preserve"> </w:t>
+      </w:r>
+      <w:r>
+        <w:t xml:space="preserve">the blocks the bot sees, and the unchanged final policy jumps: 97.8% and</w:t>
+      </w:r>
+      <w:r>
+        <w:t xml:space="preserve"> </w:t>
+      </w:r>
+      <w:r>
+        <w:t xml:space="preserve">95.0% of the standard and obstacle test courses (simulator, played once),</w:t>
+      </w:r>
+      <w:r>
+        <w:t xml:space="preserve"> </w:t>
+      </w:r>
+      <w:r>
+        <w:t xml:space="preserve">against 92.3% and 90.5% for the greedy planner, and 57 and 56 of 60 in</w:t>
+      </w:r>
+      <w:r>
+        <w:t xml:space="preserve"> </w:t>
+      </w:r>
+      <w:r>
+        <w:t xml:space="preserve">real Minecraft.</w:t>
+      </w:r>
+    </w:p>
+    <w:p>
+      <w:pPr>
+        <w:pStyle w:val="BodyText"/>
+      </w:pPr>
+      <w:r>
+        <w:t xml:space="preserve">One network trained with PPO and distillation plays every skill group about</w:t>
+      </w:r>
+      <w:r>
+        <w:t xml:space="preserve"> </w:t>
+      </w:r>
+      <w:r>
+        <w:t xml:space="preserve">as well as that group’s best specialist (test mean 86.45%, simulator): a</w:t>
+      </w:r>
+      <w:r>
+        <w:t xml:space="preserve"> </w:t>
+      </w:r>
+      <w:r>
+        <w:t xml:space="preserve">match, not a win. It completes 86.4% of the test courses with new jump</w:t>
+      </w:r>
+      <w:r>
+        <w:t xml:space="preserve"> </w:t>
+      </w:r>
+      <w:r>
+        <w:t xml:space="preserve">kinds and blocks (the final policy alone: 19.7%). Next steps are more blocks, water first, and real hand-built</w:t>
+      </w:r>
+      <w:r>
+        <w:t xml:space="preserve"> </w:t>
+      </w:r>
+      <w:r>
+        <w:t xml:space="preserve">maps.</w:t>
+      </w:r>
+    </w:p>
+    <w:p>
+      <w:pPr>
+        <w:pStyle w:val="Heading2"/>
+      </w:pPr>
+      <w:bookmarkStart w:id="41" w:name="_references"/>
+      <w:r>
+        <w:t xml:space="preserve">References</w:t>
+      </w:r>
+      <w:bookmarkEnd w:id="41"/>
     </w:p>
     <w:p>
       <w:pPr>
@@ -6629,13 +7012,7 @@
         </w:numPr>
       </w:pPr>
       <w:r>
-        <w:t xml:space="preserve">The final policy trained on stone only; the other blocks are opt-in</w:t>
-      </w:r>
-      <w:r>
-        <w:t xml:space="preserve"> </w:t>
-      </w:r>
-      <w:r>
-        <w:t xml:space="preserve">(section 3), and water is not modelled.</w:t>
+        <w:t xml:space="preserve">Baker, B. et al. (2022). Video PreTraining (VPT): Learning to Act by Watching Unlabeled Online Videos. NeurIPS.</w:t>
       </w:r>
     </w:p>
     <w:p>
@@ -6647,13 +7024,7 @@
         </w:numPr>
       </w:pPr>
       <w:r>
-        <w:t xml:space="preserve">The feasibility study uses scripted strategies from rest, so it</w:t>
-      </w:r>
-      <w:r>
-        <w:t xml:space="preserve"> </w:t>
-      </w:r>
-      <w:r>
-        <w:t xml:space="preserve">underestimates what is possible (section 7.4) and what chained jumps allow.</w:t>
+        <w:t xml:space="preserve">Bengio, Y., Louradour, J., Collobert, R., Weston, J. (2009). Curriculum Learning. ICML.</w:t>
       </w:r>
     </w:p>
     <w:p>
@@ -6665,13 +7036,7 @@
         </w:numPr>
       </w:pPr>
       <w:r>
-        <w:t xml:space="preserve">Courses are built and reset with server commands (section 6); a carpet</w:t>
-      </w:r>
-      <w:r>
-        <w:t xml:space="preserve"> </w:t>
-      </w:r>
-      <w:r>
-        <w:t xml:space="preserve">over air breaks in the game, so the bot puts a structure void under it.</w:t>
+        <w:t xml:space="preserve">Cheng, X., Shi, K., Agarwal, A., Pathak, D. (2024). Extreme Parkour with Legged Robots. ICRA.</w:t>
       </w:r>
     </w:p>
     <w:p>
@@ -6683,13 +7048,7 @@
         </w:numPr>
       </w:pPr>
       <w:r>
-        <w:t xml:space="preserve">With the neo planner the bot pauses while it searches, so those episodes</w:t>
-      </w:r>
-      <w:r>
-        <w:t xml:space="preserve"> </w:t>
-      </w:r>
-      <w:r>
-        <w:t xml:space="preserve">are not in real time.</w:t>
+        <w:t xml:space="preserve">Cobbe, K., Hesse, C., Hilton, J., Schulman, J. (2020). Leveraging Procedural Generation to Benchmark Reinforcement Learning. ICML.</w:t>
       </w:r>
     </w:p>
     <w:p>
@@ -6701,247 +7060,19 @@
         </w:numPr>
       </w:pPr>
       <w:r>
-        <w:t xml:space="preserve">Runs used an RTX 5080 and, for the learned router, the teammate’s RTX</w:t>
-      </w:r>
-      <w:r>
-        <w:t xml:space="preserve"> </w:t>
-      </w:r>
-      <w:r>
-        <w:t xml:space="preserve">4060 Ti.</w:t>
-      </w:r>
-    </w:p>
-    <w:p>
-      <w:pPr>
-        <w:pStyle w:val="Heading2"/>
-      </w:pPr>
-      <w:bookmarkStart w:id="40" w:name="_conclusion"/>
-      <w:r>
-        <w:t xml:space="preserve">9. Conclusion</w:t>
-      </w:r>
-      <w:bookmarkEnd w:id="40"/>
-    </w:p>
-    <w:p>
-      <w:pPr>
-        <w:pStyle w:val="FirstParagraph"/>
-      </w:pPr>
-      <w:r>
-        <w:t xml:space="preserve">A PPO agent trained on generated courses, in a simulator that reproduces a</w:t>
-      </w:r>
-      <w:r>
-        <w:t xml:space="preserve"> </w:t>
-      </w:r>
-      <w:r>
-        <w:t xml:space="preserve">Mineflayer bot’s movement engine, completes parkour courses it has never</w:t>
-      </w:r>
-      <w:r>
-        <w:t xml:space="preserve"> </w:t>
-      </w:r>
-      <w:r>
-        <w:t xml:space="preserve">seen: 98.4% of 1,200 held-out standard courses and 95.2% of 1,200 obstacle</w:t>
-      </w:r>
-      <w:r>
-        <w:t xml:space="preserve"> </w:t>
-      </w:r>
-      <w:r>
-        <w:t xml:space="preserve">courses (simulator; level 5: 93.5% and 81.0%). In real Minecraft the bot</w:t>
-      </w:r>
-      <w:r>
-        <w:t xml:space="preserve"> </w:t>
-      </w:r>
-      <w:r>
-        <w:t xml:space="preserve">made exactly the simulator’s courses (59 of 60 standard, 57 of 60</w:t>
-      </w:r>
-      <w:r>
-        <w:t xml:space="preserve"> </w:t>
-      </w:r>
-      <w:r>
-        <w:t xml:space="preserve">obstacle), with 0 server corrections and replays within 2.1e-14 blocks of</w:t>
-      </w:r>
-      <w:r>
-        <w:t xml:space="preserve"> </w:t>
-      </w:r>
-      <w:r>
-        <w:t xml:space="preserve">the game. Away from wall corners, where the game orders collisions</w:t>
-      </w:r>
-      <w:r>
-        <w:t xml:space="preserve"> </w:t>
-      </w:r>
-      <w:r>
-        <w:t xml:space="preserve">differently, the gap in movement between simulation and the game is</w:t>
-      </w:r>
-      <w:r>
-        <w:t xml:space="preserve"> </w:t>
-      </w:r>
-      <w:r>
-        <w:t xml:space="preserve">rounding error.</w:t>
-      </w:r>
-    </w:p>
-    <w:p>
-      <w:pPr>
-        <w:pStyle w:val="BodyText"/>
-      </w:pPr>
-      <w:r>
-        <w:t xml:space="preserve">Of our first reward ideas, the fall penalty mattered most (level 5: 72.0%</w:t>
-      </w:r>
-      <w:r>
-        <w:t xml:space="preserve"> </w:t>
-      </w:r>
-      <w:r>
-        <w:t xml:space="preserve">against 55.2%) and distance shaping made learning about three times faster;</w:t>
-      </w:r>
-      <w:r>
-        <w:t xml:space="preserve"> </w:t>
-      </w:r>
-      <w:r>
-        <w:t xml:space="preserve">neither the landing bonus nor the curriculum changed the final score</w:t>
-      </w:r>
-      <w:r>
-        <w:t xml:space="preserve"> </w:t>
-      </w:r>
-      <w:r>
-        <w:t xml:space="preserve">reliably. On neo jumps, which random tries rarely land, the same penalty</w:t>
-      </w:r>
-      <w:r>
-        <w:t xml:space="preserve"> </w:t>
-      </w:r>
-      <w:r>
-        <w:t xml:space="preserve">made refusing cheaper than trying: PPO alone never made one. Search</w:t>
-      </w:r>
-      <w:r>
-        <w:t xml:space="preserve"> </w:t>
-      </w:r>
-      <w:r>
-        <w:t xml:space="preserve">demonstrations and DAgger raised the completed level 6-8 neo test courses</w:t>
-      </w:r>
-      <w:r>
-        <w:t xml:space="preserve"> </w:t>
-      </w:r>
-      <w:r>
-        <w:t xml:space="preserve">from 0 to 29.0% (simulator). Searching each takeoff at play time with the</w:t>
-      </w:r>
-      <w:r>
-        <w:t xml:space="preserve"> </w:t>
-      </w:r>
-      <w:r>
-        <w:t xml:space="preserve">exact simulator met the 85% single-neo goal, narrowly: 276 of 320 test</w:t>
-      </w:r>
-      <w:r>
-        <w:t xml:space="preserve"> </w:t>
-      </w:r>
-      <w:r>
-        <w:t xml:space="preserve">courses (86.25%, strict, simulator, played once) against 42.8% for the best</w:t>
-      </w:r>
-      <w:r>
-        <w:t xml:space="preserve"> </w:t>
-      </w:r>
-      <w:r>
-        <w:t xml:space="preserve">policy alone; in real Minecraft the bot made the simulator’s courses on the</w:t>
-      </w:r>
-      <w:r>
-        <w:t xml:space="preserve"> </w:t>
-      </w:r>
-      <w:r>
-        <w:t xml:space="preserve">first 64 of them (58, then 55 after two later fixes; section 7.8), with 0</w:t>
-      </w:r>
-      <w:r>
-        <w:t xml:space="preserve"> </w:t>
-      </w:r>
-      <w:r>
-        <w:t xml:space="preserve">corrections.</w:t>
-      </w:r>
-    </w:p>
-    <w:p>
-      <w:pPr>
-        <w:pStyle w:val="BodyText"/>
-      </w:pPr>
-      <w:r>
-        <w:t xml:space="preserve">Without the course list, a learned router trained with PPO plus an</w:t>
-      </w:r>
-      <w:r>
-        <w:t xml:space="preserve"> </w:t>
-      </w:r>
-      <w:r>
-        <w:t xml:space="preserve">imitation term towards the course’s next platform picks each platform from</w:t>
-      </w:r>
-      <w:r>
-        <w:t xml:space="preserve"> </w:t>
-      </w:r>
-      <w:r>
-        <w:t xml:space="preserve">the blocks the bot sees, and the unchanged final policy jumps: 97.8% and</w:t>
-      </w:r>
-      <w:r>
-        <w:t xml:space="preserve"> </w:t>
-      </w:r>
-      <w:r>
-        <w:t xml:space="preserve">95.0% of the standard and obstacle test courses (simulator, played once),</w:t>
-      </w:r>
-      <w:r>
-        <w:t xml:space="preserve"> </w:t>
-      </w:r>
-      <w:r>
-        <w:t xml:space="preserve">against 92.3% and 90.5% for the greedy planner, and 57 and 56 of 60 in</w:t>
-      </w:r>
-      <w:r>
-        <w:t xml:space="preserve"> </w:t>
-      </w:r>
-      <w:r>
-        <w:t xml:space="preserve">real Minecraft.</w:t>
-      </w:r>
-    </w:p>
-    <w:p>
-      <w:pPr>
-        <w:pStyle w:val="BodyText"/>
-      </w:pPr>
-      <w:r>
-        <w:t xml:space="preserve">One network trained with PPO and distillation plays every skill group about</w:t>
-      </w:r>
-      <w:r>
-        <w:t xml:space="preserve"> </w:t>
-      </w:r>
-      <w:r>
-        <w:t xml:space="preserve">as well as that group’s best specialist (test mean 86.45%, simulator): a</w:t>
-      </w:r>
-      <w:r>
-        <w:t xml:space="preserve"> </w:t>
-      </w:r>
-      <w:r>
-        <w:t xml:space="preserve">match, not a win. It completes 86.4% of the test courses with new jump</w:t>
-      </w:r>
-      <w:r>
-        <w:t xml:space="preserve"> </w:t>
-      </w:r>
-      <w:r>
-        <w:t xml:space="preserve">kinds and blocks (the final policy alone: 19.7%).</w:t>
-      </w:r>
-    </w:p>
-    <w:p>
-      <w:pPr>
-        <w:pStyle w:val="BodyText"/>
-      </w:pPr>
-      <w:r>
-        <w:t xml:space="preserve">Next steps are more blocks, water first, and real hand-built maps.</w:t>
-      </w:r>
-    </w:p>
-    <w:p>
-      <w:pPr>
-        <w:pStyle w:val="Heading2"/>
-      </w:pPr>
-      <w:bookmarkStart w:id="41" w:name="_references"/>
-      <w:r>
-        <w:t xml:space="preserve">References</w:t>
-      </w:r>
-      <w:bookmarkEnd w:id="41"/>
+        <w:t xml:space="preserve">Guss, W. H. et al. (2019). MineRL: A Large-Scale Dataset of Minecraft Demonstrations. IJCAI.</w:t>
+      </w:r>
     </w:p>
     <w:p>
       <w:pPr>
         <w:pStyle w:val="Compact"/>
         <w:numPr>
           <w:ilvl w:val="0"/>
-          <w:numId w:val="1006"/>
+          <w:numId w:val="1005"/>
         </w:numPr>
       </w:pPr>
       <w:r>
-        <w:t xml:space="preserve">Baker, B. et al. (2022). Video PreTraining (VPT): Learning to Act by Watching Unlabeled Online Videos. NeurIPS.</w:t>
+        <w:t xml:space="preserve">Heess, N. et al. (2017). Emergence of Locomotion Behaviours in Rich Environments. arXiv:1707.02286.</w:t>
       </w:r>
     </w:p>
     <w:p>
@@ -6949,11 +7080,11 @@
         <w:pStyle w:val="Compact"/>
         <w:numPr>
           <w:ilvl w:val="0"/>
-          <w:numId w:val="1006"/>
+          <w:numId w:val="1005"/>
         </w:numPr>
       </w:pPr>
       <w:r>
-        <w:t xml:space="preserve">Bengio, Y., Louradour, J., Collobert, R., Weston, J. (2009). Curriculum Learning. ICML.</w:t>
+        <w:t xml:space="preserve">Jacobs, R. A., Jordan, M. I., Nowlan, S. J., Hinton, G. E. (1991). Adaptive Mixtures of Local Experts. Neural Computation 3(1), 79-87.</w:t>
       </w:r>
     </w:p>
     <w:p>
@@ -6961,11 +7092,11 @@
         <w:pStyle w:val="Compact"/>
         <w:numPr>
           <w:ilvl w:val="0"/>
-          <w:numId w:val="1006"/>
+          <w:numId w:val="1005"/>
         </w:numPr>
       </w:pPr>
       <w:r>
-        <w:t xml:space="preserve">Cheng, X., Shi, K., Agarwal, A., Pathak, D. (2024). Extreme Parkour with Legged Robots. ICRA.</w:t>
+        <w:t xml:space="preserve">Ng, A. Y., Harada, D., Russell, S. (1999). Policy Invariance under Reward Transformations: Theory and Application to Reward Shaping. ICML.</w:t>
       </w:r>
     </w:p>
     <w:p>
@@ -6973,11 +7104,11 @@
         <w:pStyle w:val="Compact"/>
         <w:numPr>
           <w:ilvl w:val="0"/>
-          <w:numId w:val="1006"/>
+          <w:numId w:val="1005"/>
         </w:numPr>
       </w:pPr>
       <w:r>
-        <w:t xml:space="preserve">Cobbe, K., Hesse, C., Hilton, J., Schulman, J. (2020). Leveraging Procedural Generation to Benchmark Reinforcement Learning. ICML.</w:t>
+        <w:t xml:space="preserve">PrismarineJS. mineflayer 4.39.0 and prismarine-physics 1.11.1. https://github.com/PrismarineJS</w:t>
       </w:r>
     </w:p>
     <w:p>
@@ -6985,11 +7116,11 @@
         <w:pStyle w:val="Compact"/>
         <w:numPr>
           <w:ilvl w:val="0"/>
-          <w:numId w:val="1006"/>
+          <w:numId w:val="1005"/>
         </w:numPr>
       </w:pPr>
       <w:r>
-        <w:t xml:space="preserve">Guss, W. H. et al. (2019). MineRL: A Large-Scale Dataset of Minecraft Demonstrations. IJCAI.</w:t>
+        <w:t xml:space="preserve">Ross, S., Gordon, G., Bagnell, D. (2011). A Reduction of Imitation Learning and Structured Prediction to No-Regret Online Learning. AISTATS.</w:t>
       </w:r>
     </w:p>
     <w:p>
@@ -6997,11 +7128,11 @@
         <w:pStyle w:val="Compact"/>
         <w:numPr>
           <w:ilvl w:val="0"/>
-          <w:numId w:val="1006"/>
+          <w:numId w:val="1005"/>
         </w:numPr>
       </w:pPr>
       <w:r>
-        <w:t xml:space="preserve">Heess, N. et al. (2017). Emergence of Locomotion Behaviours in Rich Environments. arXiv:1707.02286.</w:t>
+        <w:t xml:space="preserve">Rubinstein, R. Y. (1999). The Cross-Entropy Method for Combinatorial and Continuous Optimization. Methodology and Computing in Applied Probability 1(2), 127-190.</w:t>
       </w:r>
     </w:p>
     <w:p>
@@ -7009,11 +7140,11 @@
         <w:pStyle w:val="Compact"/>
         <w:numPr>
           <w:ilvl w:val="0"/>
-          <w:numId w:val="1006"/>
+          <w:numId w:val="1005"/>
         </w:numPr>
       </w:pPr>
       <w:r>
-        <w:t xml:space="preserve">Jacobs, R. A., Jordan, M. I., Nowlan, S. J., Hinton, G. E. (1991). Adaptive Mixtures of Local Experts. Neural Computation 3(1), 79-87.</w:t>
+        <w:t xml:space="preserve">Rudin, N., Hoeller, D., Reist, P., Hutter, M. (2021). Learning to Walk in Minutes Using Massively Parallel Deep Reinforcement Learning. CoRL.</w:t>
       </w:r>
     </w:p>
     <w:p>
@@ -7021,11 +7152,11 @@
         <w:pStyle w:val="Compact"/>
         <w:numPr>
           <w:ilvl w:val="0"/>
-          <w:numId w:val="1006"/>
+          <w:numId w:val="1005"/>
         </w:numPr>
       </w:pPr>
       <w:r>
-        <w:t xml:space="preserve">Ng, A. Y., Harada, D., Russell, S. (1999). Policy Invariance under Reward Transformations: Theory and Application to Reward Shaping. ICML.</w:t>
+        <w:t xml:space="preserve">Rusu, A. A. et al. (2016). Policy Distillation. ICLR.</w:t>
       </w:r>
     </w:p>
     <w:p>
@@ -7033,11 +7164,11 @@
         <w:pStyle w:val="Compact"/>
         <w:numPr>
           <w:ilvl w:val="0"/>
-          <w:numId w:val="1006"/>
+          <w:numId w:val="1005"/>
         </w:numPr>
       </w:pPr>
       <w:r>
-        <w:t xml:space="preserve">PrismarineJS. mineflayer 4.39.0 and prismarine-physics 1.11.1. https://github.com/PrismarineJS</w:t>
+        <w:t xml:space="preserve">Schulman, J., Moritz, P., Levine, S., Jordan, M., Abbeel, P. (2016). High-Dimensional Continuous Control Using Generalized Advantage Estimation. ICLR.</w:t>
       </w:r>
     </w:p>
     <w:p>
@@ -7045,11 +7176,11 @@
         <w:pStyle w:val="Compact"/>
         <w:numPr>
           <w:ilvl w:val="0"/>
-          <w:numId w:val="1006"/>
+          <w:numId w:val="1005"/>
         </w:numPr>
       </w:pPr>
       <w:r>
-        <w:t xml:space="preserve">Ross, S., Gordon, G., Bagnell, D. (2011). A Reduction of Imitation Learning and Structured Prediction to No-Regret Online Learning. AISTATS.</w:t>
+        <w:t xml:space="preserve">Schulman, J., Wolski, F., Dhariwal, P., Radford, A., Klimov, O. (2017). Proximal Policy Optimization Algorithms. arXiv:1707.06347.</w:t>
       </w:r>
     </w:p>
     <w:p>
@@ -7057,11 +7188,11 @@
         <w:pStyle w:val="Compact"/>
         <w:numPr>
           <w:ilvl w:val="0"/>
-          <w:numId w:val="1006"/>
+          <w:numId w:val="1005"/>
         </w:numPr>
       </w:pPr>
       <w:r>
-        <w:t xml:space="preserve">Rubinstein, R. Y. (1999). The Cross-Entropy Method for Combinatorial and Continuous Optimization. Methodology and Computing in Applied Probability 1(2), 127-190.</w:t>
+        <w:t xml:space="preserve">Sutton, R. S., Precup, D., Singh, S. (1999). Between MDPs and Semi-MDPs: A Framework for Temporal Abstraction in Reinforcement Learning. Artificial Intelligence 112(1-2), 181-211.</w:t>
       </w:r>
     </w:p>
     <w:p>
@@ -7069,11 +7200,11 @@
         <w:pStyle w:val="Compact"/>
         <w:numPr>
           <w:ilvl w:val="0"/>
-          <w:numId w:val="1006"/>
+          <w:numId w:val="1005"/>
         </w:numPr>
       </w:pPr>
       <w:r>
-        <w:t xml:space="preserve">Rudin, N., Hoeller, D., Reist, P., Hutter, M. (2021). Learning to Walk in Minutes Using Massively Parallel Deep Reinforcement Learning. CoRL.</w:t>
+        <w:t xml:space="preserve">Ye, D. et al. (2020). Mastering Complex Control in MOBA Games with Deep Reinforcement Learning. AAAI.</w:t>
       </w:r>
     </w:p>
     <w:p>
@@ -7081,67 +7212,7 @@
         <w:pStyle w:val="Compact"/>
         <w:numPr>
           <w:ilvl w:val="0"/>
-          <w:numId w:val="1006"/>
-        </w:numPr>
-      </w:pPr>
-      <w:r>
-        <w:t xml:space="preserve">Rusu, A. A. et al. (2016). Policy Distillation. ICLR.</w:t>
-      </w:r>
-    </w:p>
-    <w:p>
-      <w:pPr>
-        <w:pStyle w:val="Compact"/>
-        <w:numPr>
-          <w:ilvl w:val="0"/>
-          <w:numId w:val="1006"/>
-        </w:numPr>
-      </w:pPr>
-      <w:r>
-        <w:t xml:space="preserve">Schulman, J., Moritz, P., Levine, S., Jordan, M., Abbeel, P. (2016). High-Dimensional Continuous Control Using Generalized Advantage Estimation. ICLR.</w:t>
-      </w:r>
-    </w:p>
-    <w:p>
-      <w:pPr>
-        <w:pStyle w:val="Compact"/>
-        <w:numPr>
-          <w:ilvl w:val="0"/>
-          <w:numId w:val="1006"/>
-        </w:numPr>
-      </w:pPr>
-      <w:r>
-        <w:t xml:space="preserve">Schulman, J., Wolski, F., Dhariwal, P., Radford, A., Klimov, O. (2017). Proximal Policy Optimization Algorithms. arXiv:1707.06347.</w:t>
-      </w:r>
-    </w:p>
-    <w:p>
-      <w:pPr>
-        <w:pStyle w:val="Compact"/>
-        <w:numPr>
-          <w:ilvl w:val="0"/>
-          <w:numId w:val="1006"/>
-        </w:numPr>
-      </w:pPr>
-      <w:r>
-        <w:t xml:space="preserve">Sutton, R. S., Precup, D., Singh, S. (1999). Between MDPs and Semi-MDPs: A Framework for Temporal Abstraction in Reinforcement Learning. Artificial Intelligence 112(1-2), 181-211.</w:t>
-      </w:r>
-    </w:p>
-    <w:p>
-      <w:pPr>
-        <w:pStyle w:val="Compact"/>
-        <w:numPr>
-          <w:ilvl w:val="0"/>
-          <w:numId w:val="1006"/>
-        </w:numPr>
-      </w:pPr>
-      <w:r>
-        <w:t xml:space="preserve">Ye, D. et al. (2020). Mastering Complex Control in MOBA Games with Deep Reinforcement Learning. AAAI.</w:t>
-      </w:r>
-    </w:p>
-    <w:p>
-      <w:pPr>
-        <w:pStyle w:val="Compact"/>
-        <w:numPr>
-          <w:ilvl w:val="0"/>
-          <w:numId w:val="1006"/>
+          <w:numId w:val="1005"/>
         </w:numPr>
       </w:pPr>
       <w:r>
@@ -7490,9 +7561,6 @@
     <w:abstractNumId w:val="991"/>
   </w:num>
   <w:num w:numId="1005">
-    <w:abstractNumId w:val="991"/>
-  </w:num>
-  <w:num w:numId="1006">
     <w:abstractNumId w:val="991"/>
   </w:num>
 </w:numbering>

</xml_diff>